<commit_message>
docs: finalize The Cerebellum submission candidate v0.2.3
</commit_message>
<xml_diff>
--- a/submission/the-cerebellum/package/01_Main_Manuscript.docx
+++ b/submission/the-cerebellum/package/01_Main_Manuscript.docx
@@ -110,7 +110,7 @@
           <w:color w:val="000000"/>
           <w:sz w:val="19"/>
         </w:rPr>
-        <w:t>Manuscript version 0.2.1; evidence cut-off 19 August 2026</w:t>
+        <w:t>Manuscript version 0.2.3; evidence cut-off 19 August 2026</w:t>
       </w:r>
     </w:p>
     <w:p>
@@ -378,7 +378,7 @@
           <w:color w:val="000000"/>
           <w:sz w:val="20"/>
         </w:rPr>
-        <w:t xml:space="preserve">No human SCA study has demonstrated </w:t>
+        <w:t xml:space="preserve">The human SCA evidence identified in this review does not demonstrate </w:t>
       </w:r>
       <m:oMath>
         <m:r>
@@ -395,7 +395,7 @@
           <w:color w:val="000000"/>
           <w:sz w:val="20"/>
         </w:rPr>
-        <w:t>, the gate, outward leakage, or the predicted low-input idle–intermediate depletion–high-input rebalance curve. Existing evidence supports only component premises: onset heterogeneity, selected premanifest biomarkers, cerebellar reserve, and model-specific multicellular causation or early reversibility. We outline an event-driven SCA3 test bed with SCA6 transport testing and target-specific early-intervention examples. Failure of external replication, temporal ordering, or improvement over known-mechanism models rejects the corresponding layer. The framework is a research programme, not a treatment recommendation.</w:t>
+        <w:t>, the gate, outward loss, or the predicted low-input idle–intermediate depletion–high-input rebalance curve. Existing evidence supports only component premises: onset heterogeneity, selected preataxic biomarkers, cerebellar reserve, and model-specific multicellular causation or early reversibility. We outline an event-driven SCA3 test bed with SCA6 transport testing and target-specific early-intervention examples. Failure of external replication, temporal ordering, or improvement over known-mechanism models rejects the corresponding layer. The framework is a research programme, not a treatment recommendation.</w:t>
       </w:r>
     </w:p>
     <w:p>
@@ -415,7 +415,7 @@
           <w:color w:val="000000"/>
           <w:sz w:val="20"/>
         </w:rPr>
-        <w:t>spinocerebellar ataxia; cerebellar reserve; environmental exposure; phenoconversion; biomarkers; disease modification</w:t>
+        <w:t>Spinocerebellar Ataxias; Cerebellum; Environmental Exposure; Disease Progression; Biomarkers; Genetic Predisposition to Disease</w:t>
       </w:r>
     </w:p>
     <w:p>
@@ -444,7 +444,7 @@
           <w:color w:val="000000"/>
           <w:sz w:val="20"/>
         </w:rPr>
-        <w:t>Some hereditary cerebellar ataxias may contain a testable mismatch between genetic demand, externally conditioned activation, and dynamic reserve—but the unknown-input extension earns causal status only if it predicts new data and ordered mediators better than known-mechanism models.</w:t>
+        <w:t>Some hereditary cerebellar ataxias may contain a testable mismatch between genetic demand, externally conditioned activation, and dynamic reserve—but the unknown-input extension earns causal status only if it predicts new data, produces the specified mediator order, and survives selective perturbation better than known-mechanism models.</w:t>
       </w:r>
     </w:p>
     <w:p>
@@ -473,7 +473,7 @@
           <w:color w:val="000000"/>
           <w:sz w:val="20"/>
         </w:rPr>
-        <w:t>Throughout this new-idea review, claims are separated into four levels:</w:t>
+        <w:t>Throughout this new-idea article, we separate claims into four levels:</w:t>
       </w:r>
     </w:p>
     <w:p>
@@ -628,7 +628,7 @@
       <w:r>
         <w:drawing>
           <wp:inline xmlns:a="http://schemas.openxmlformats.org/drawingml/2006/main" xmlns:pic="http://schemas.openxmlformats.org/drawingml/2006/picture">
-            <wp:extent cx="5760720" cy="3463962"/>
+            <wp:extent cx="5760720" cy="3336744"/>
             <wp:docPr id="1" name="Picture 1" descr="Nested causal framework"/>
             <wp:cNvGraphicFramePr>
               <a:graphicFrameLocks noChangeAspect="1"/>
@@ -649,7 +649,7 @@
                   <pic:spPr>
                     <a:xfrm>
                       <a:off x="0" y="0"/>
-                      <a:ext cx="5760720" cy="3463962"/>
+                      <a:ext cx="5760720" cy="3336744"/>
                     </a:xfrm>
                     <a:prstGeom prst="rect"/>
                   </pic:spPr>
@@ -671,7 +671,7 @@
           <w:color w:val="000000"/>
           <w:sz w:val="18"/>
         </w:rPr>
-        <w:t>Figure 1. A nested, falsifiable maintenance–reserve–gating model.</w:t>
+        <w:t>Fig. 1</w:t>
       </w:r>
       <w:r>
         <w:rPr>
@@ -680,7 +680,7 @@
           <w:color w:val="000000"/>
           <w:sz w:val="18"/>
         </w:rPr>
-        <w:t xml:space="preserve"> Solid edges summarize empirically supported relationships in at least one cited system; dashed edges are hypothesis-specific. </w:t>
+        <w:t xml:space="preserve"> A nested, falsifiable maintenance–reserve–gating model. Solid edges summarize empirically supported relationships in at least one cited system; dashed edges are hypothesis-specific. </w:t>
       </w:r>
       <m:oMath>
         <m:r>
@@ -991,185 +991,7 @@
           <w:color w:val="000000"/>
           <w:sz w:val="18"/>
         </w:rPr>
-        <w:t xml:space="preserve"> is a candidate factor measured by observed biomarkers, not a second causal substance. Evidence for an individual solid edge does not validate the complete path.</w:t>
-      </w:r>
-    </w:p>
-    <w:p>
-      <w:pPr>
-        <w:pStyle w:val="Heading1"/>
-      </w:pPr>
-      <w:r>
-        <w:rPr>
-          <w:rFonts w:ascii="Times New Roman" w:hAnsi="Times New Roman" w:eastAsia="Times New Roman"/>
-          <w:b/>
-          <w:color w:val="000000"/>
-          <w:sz w:val="24"/>
-        </w:rPr>
-        <w:t>1. The unresolved timing problem</w:t>
-      </w:r>
-    </w:p>
-    <w:p>
-      <w:pPr>
-        <w:keepLines w:val="0"/>
-        <w:jc w:val="both"/>
-      </w:pPr>
-      <w:r>
-        <w:rPr>
-          <w:rFonts w:ascii="Times New Roman" w:hAnsi="Times New Roman" w:eastAsia="Times New Roman"/>
-          <w:b w:val="0"/>
-          <w:color w:val="000000"/>
-          <w:sz w:val="20"/>
-        </w:rPr>
-        <w:t>The minimal genetic model of an SCA is compelling:</w:t>
-      </w:r>
-    </w:p>
-    <w:p>
-      <w:pPr>
-        <w:keepLines/>
-        <w:spacing w:before="80" w:after="120"/>
-        <w:jc w:val="center"/>
-      </w:pPr>
-      <m:oMath>
-        <m:r>
-          <m:rPr>
-            <m:nor/>
-          </m:rPr>
-          <m:t>G</m:t>
-        </m:r>
-        <m:r>
-          <m:rPr>
-            <m:nor/>
-          </m:rPr>
-          <m:t> </m:t>
-        </m:r>
-        <m:r>
-          <m:rPr>
-            <m:nor/>
-          </m:rPr>
-          <m:t>→</m:t>
-        </m:r>
-        <m:r>
-          <m:rPr>
-            <m:nor/>
-          </m:rPr>
-          <m:t> </m:t>
-        </m:r>
-        <m:sSub>
-          <m:e>
-            <m:r>
-              <m:rPr>
-                <m:nor/>
-              </m:rPr>
-              <m:t>D</m:t>
-            </m:r>
-          </m:e>
-          <m:sub>
-            <m:r>
-              <m:rPr>
-                <m:nor/>
-              </m:rPr>
-              <m:t>G</m:t>
-            </m:r>
-          </m:sub>
-        </m:sSub>
-        <m:r>
-          <m:rPr>
-            <m:nor/>
-          </m:rPr>
-          <m:t> </m:t>
-        </m:r>
-        <m:r>
-          <m:rPr>
-            <m:nor/>
-          </m:rPr>
-          <m:t>→</m:t>
-        </m:r>
-        <m:r>
-          <m:rPr>
-            <m:nor/>
-          </m:rPr>
-          <m:t> </m:t>
-        </m:r>
-        <m:r>
-          <m:rPr>
-            <m:nor/>
-          </m:rPr>
-          <m:t>neuronal</m:t>
-        </m:r>
-        <m:r>
-          <m:rPr>
-            <m:nor/>
-          </m:rPr>
-          <m:t> </m:t>
-        </m:r>
-        <m:r>
-          <m:rPr>
-            <m:nor/>
-          </m:rPr>
-          <m:t>dysfunction</m:t>
-        </m:r>
-        <m:r>
-          <m:rPr>
-            <m:nor/>
-          </m:rPr>
-          <m:t> </m:t>
-        </m:r>
-        <m:r>
-          <m:rPr>
-            <m:nor/>
-          </m:rPr>
-          <m:t>→</m:t>
-        </m:r>
-        <m:r>
-          <m:rPr>
-            <m:nor/>
-          </m:rPr>
-          <m:t> </m:t>
-        </m:r>
-        <m:r>
-          <m:rPr>
-            <m:nor/>
-          </m:rPr>
-          <m:t>degeneration</m:t>
-        </m:r>
-        <m:r>
-          <m:rPr>
-            <m:nor/>
-          </m:rPr>
-          <m:t>,</m:t>
-        </m:r>
-      </m:oMath>
-    </w:p>
-    <w:p>
-      <w:pPr>
-        <w:keepLines w:val="0"/>
-        <w:jc w:val="both"/>
-      </w:pPr>
-      <w:r>
-        <w:rPr>
-          <w:rFonts w:ascii="Times New Roman" w:hAnsi="Times New Roman" w:eastAsia="Times New Roman"/>
-          <w:b w:val="0"/>
-          <w:color w:val="000000"/>
-          <w:sz w:val="20"/>
-        </w:rPr>
-        <w:t xml:space="preserve">where </w:t>
-      </w:r>
-      <m:oMath>
-        <m:r>
-          <m:rPr>
-            <m:nor/>
-          </m:rPr>
-          <m:t>G</m:t>
-        </m:r>
-      </m:oMath>
-      <w:r>
-        <w:rPr>
-          <w:rFonts w:ascii="Times New Roman" w:hAnsi="Times New Roman" w:eastAsia="Times New Roman"/>
-          <w:b w:val="0"/>
-          <w:color w:val="000000"/>
-          <w:sz w:val="20"/>
-        </w:rPr>
-        <w:t xml:space="preserve"> is the causal genotype and </w:t>
+        <w:t xml:space="preserve"> is a candidate factor measured by observed biomarkers, not a second causal substance. Evidence for an individual solid edge does not validate the complete path. </w:t>
       </w:r>
       <m:oMath>
         <m:sSub>
@@ -1196,13 +1018,27 @@
           <w:rFonts w:ascii="Times New Roman" w:hAnsi="Times New Roman" w:eastAsia="Times New Roman"/>
           <w:b w:val="0"/>
           <w:color w:val="000000"/>
-          <w:sz w:val="20"/>
-        </w:rPr>
-        <w:t xml:space="preserve"> includes abnormal protein, RNA, ion-channel, transcriptional, calcium, proteostatic, or mitochondrial pressure. This model explains why the disease occurs. It does not, by itself, uniquely determine the individual timetable.</w:t>
+          <w:sz w:val="18"/>
+        </w:rPr>
+        <w:t>, genotype-linked pathogenic pressure; ER, endoplasmic reticulum; MLIN, molecular-layer interneuron; NfL, neurofilament light chain; MRI, magnetic resonance imaging; MRS, magnetic resonance spectroscopy</w:t>
       </w:r>
     </w:p>
     <w:p>
       <w:pPr>
+        <w:pStyle w:val="Heading1"/>
+      </w:pPr>
+      <w:r>
+        <w:rPr>
+          <w:rFonts w:ascii="Times New Roman" w:hAnsi="Times New Roman" w:eastAsia="Times New Roman"/>
+          <w:b/>
+          <w:color w:val="000000"/>
+          <w:sz w:val="24"/>
+        </w:rPr>
+        <w:t>1. The unresolved timing problem</w:t>
+      </w:r>
+    </w:p>
+    <w:p>
+      <w:pPr>
         <w:keepLines w:val="0"/>
         <w:jc w:val="both"/>
       </w:pPr>
@@ -1213,7 +1049,200 @@
           <w:color w:val="000000"/>
           <w:sz w:val="20"/>
         </w:rPr>
-        <w:t>In a five-region cohort of 786 people with SCA3/MJD, expanded ATXN3 CAG length explained approximately 62% of age-at-onset variance [1]. That value is cohort-specific, not a universal constant. A 2026 study associated rare APOE ε4 homozygosity with onset about six years earlier in a Brazilian subgroup, but the signal was initial, subgroup-specific, and absent for common APOE contrasts [2]. In a four-family SCA6 series, two large families had stable 22- and 23-repeat expanded alleles, while the age at onset across affected participants was 24–63 years [3]. A study of only two monozygotic twin pairs—one SCA2 and one clinically diagnosed episodic ataxia type 2—reported quantitative discordance in eye movements, postural stability, severity, and regional involvement [4]. These observations justify looking for germline modifiers, somatic instability, stochastic biology, measurement error, and external influences. They do not identify a common environmental factor.</w:t>
+        <w:t>The minimal genetic model of a spinocerebellar ataxia (SCA) is compelling:</w:t>
+      </w:r>
+    </w:p>
+    <w:p>
+      <w:pPr>
+        <w:keepLines/>
+        <w:spacing w:before="80" w:after="120"/>
+        <w:jc w:val="center"/>
+      </w:pPr>
+      <m:oMath>
+        <m:r>
+          <m:rPr>
+            <m:nor/>
+          </m:rPr>
+          <m:t>G</m:t>
+        </m:r>
+        <m:r>
+          <m:rPr>
+            <m:nor/>
+          </m:rPr>
+          <m:t> </m:t>
+        </m:r>
+        <m:r>
+          <m:rPr>
+            <m:nor/>
+          </m:rPr>
+          <m:t>→</m:t>
+        </m:r>
+        <m:r>
+          <m:rPr>
+            <m:nor/>
+          </m:rPr>
+          <m:t> </m:t>
+        </m:r>
+        <m:sSub>
+          <m:e>
+            <m:r>
+              <m:rPr>
+                <m:nor/>
+              </m:rPr>
+              <m:t>D</m:t>
+            </m:r>
+          </m:e>
+          <m:sub>
+            <m:r>
+              <m:rPr>
+                <m:nor/>
+              </m:rPr>
+              <m:t>G</m:t>
+            </m:r>
+          </m:sub>
+        </m:sSub>
+        <m:r>
+          <m:rPr>
+            <m:nor/>
+          </m:rPr>
+          <m:t> </m:t>
+        </m:r>
+        <m:r>
+          <m:rPr>
+            <m:nor/>
+          </m:rPr>
+          <m:t>→</m:t>
+        </m:r>
+        <m:r>
+          <m:rPr>
+            <m:nor/>
+          </m:rPr>
+          <m:t> </m:t>
+        </m:r>
+        <m:r>
+          <m:rPr>
+            <m:nor/>
+          </m:rPr>
+          <m:t>neuronal</m:t>
+        </m:r>
+        <m:r>
+          <m:rPr>
+            <m:nor/>
+          </m:rPr>
+          <m:t> </m:t>
+        </m:r>
+        <m:r>
+          <m:rPr>
+            <m:nor/>
+          </m:rPr>
+          <m:t>dysfunction</m:t>
+        </m:r>
+        <m:r>
+          <m:rPr>
+            <m:nor/>
+          </m:rPr>
+          <m:t> </m:t>
+        </m:r>
+        <m:r>
+          <m:rPr>
+            <m:nor/>
+          </m:rPr>
+          <m:t>→</m:t>
+        </m:r>
+        <m:r>
+          <m:rPr>
+            <m:nor/>
+          </m:rPr>
+          <m:t> </m:t>
+        </m:r>
+        <m:r>
+          <m:rPr>
+            <m:nor/>
+          </m:rPr>
+          <m:t>degeneration</m:t>
+        </m:r>
+        <m:r>
+          <m:rPr>
+            <m:nor/>
+          </m:rPr>
+          <m:t>,</m:t>
+        </m:r>
+      </m:oMath>
+    </w:p>
+    <w:p>
+      <w:pPr>
+        <w:keepLines w:val="0"/>
+        <w:jc w:val="both"/>
+      </w:pPr>
+      <w:r>
+        <w:rPr>
+          <w:rFonts w:ascii="Times New Roman" w:hAnsi="Times New Roman" w:eastAsia="Times New Roman"/>
+          <w:b w:val="0"/>
+          <w:color w:val="000000"/>
+          <w:sz w:val="20"/>
+        </w:rPr>
+        <w:t xml:space="preserve">where </w:t>
+      </w:r>
+      <m:oMath>
+        <m:r>
+          <m:rPr>
+            <m:nor/>
+          </m:rPr>
+          <m:t>G</m:t>
+        </m:r>
+      </m:oMath>
+      <w:r>
+        <w:rPr>
+          <w:rFonts w:ascii="Times New Roman" w:hAnsi="Times New Roman" w:eastAsia="Times New Roman"/>
+          <w:b w:val="0"/>
+          <w:color w:val="000000"/>
+          <w:sz w:val="20"/>
+        </w:rPr>
+        <w:t xml:space="preserve"> is the causal genotype and </w:t>
+      </w:r>
+      <m:oMath>
+        <m:sSub>
+          <m:e>
+            <m:r>
+              <m:rPr>
+                <m:nor/>
+              </m:rPr>
+              <m:t>D</m:t>
+            </m:r>
+          </m:e>
+          <m:sub>
+            <m:r>
+              <m:rPr>
+                <m:nor/>
+              </m:rPr>
+              <m:t>G</m:t>
+            </m:r>
+          </m:sub>
+        </m:sSub>
+      </m:oMath>
+      <w:r>
+        <w:rPr>
+          <w:rFonts w:ascii="Times New Roman" w:hAnsi="Times New Roman" w:eastAsia="Times New Roman"/>
+          <w:b w:val="0"/>
+          <w:color w:val="000000"/>
+          <w:sz w:val="20"/>
+        </w:rPr>
+        <w:t xml:space="preserve"> includes abnormal protein, RNA, ion-channel, transcriptional, calcium, proteostatic, or mitochondrial pressure. This model explains why the disease occurs. It does not, by itself, uniquely determine the individual timetable.</w:t>
+      </w:r>
+    </w:p>
+    <w:p>
+      <w:pPr>
+        <w:keepLines w:val="0"/>
+        <w:jc w:val="both"/>
+      </w:pPr>
+      <w:r>
+        <w:rPr>
+          <w:rFonts w:ascii="Times New Roman" w:hAnsi="Times New Roman" w:eastAsia="Times New Roman"/>
+          <w:b w:val="0"/>
+          <w:color w:val="000000"/>
+          <w:sz w:val="20"/>
+        </w:rPr>
+        <w:t>In a five-region cohort of 786 people with SCA3/Machado–Joseph disease (MJD), expanded ATXN3 CAG length explained approximately 62% of age-at-onset variance [1]. That value is cohort-specific, not a universal constant. A 2026 study associated rare APOE ε4 homozygosity with onset about six years earlier in a Brazilian subgroup, but the signal was initial, subgroup-specific, and absent for common APOE contrasts [2]. In a four-family SCA6 series, two large families had stable 22- and 23-repeat expanded alleles, while the age at onset across affected participants was 24–63 years [3]. A study of only two monozygotic twin pairs—one SCA2 and one clinically diagnosed episodic ataxia type 2—reported quantitative discordance in eye movements, postural stability, severity, and regional involvement [4]. These observations justify looking for germline modifiers, somatic instability, stochastic biology, measurement error, and external influences. They do not identify a common environmental factor.</w:t>
       </w:r>
     </w:p>
     <w:p>
@@ -1592,7 +1621,7 @@
           <w:color w:val="000000"/>
           <w:sz w:val="20"/>
         </w:rPr>
-        <w:t xml:space="preserve">The phrase </w:t>
+        <w:t xml:space="preserve">We avoid the phrase </w:t>
       </w:r>
       <w:r>
         <w:rPr>
@@ -1611,7 +1640,7 @@
           <w:color w:val="000000"/>
           <w:sz w:val="20"/>
         </w:rPr>
-        <w:t xml:space="preserve"> is avoided because it suggests that a molecule or field has already been found. No such entity is known. The testable framework separates an observable modifier layer from an optional mechanistic extension.</w:t>
+        <w:t xml:space="preserve"> because it suggests that a molecule or field has already been found. No such entity is known. The testable framework separates an observable modifier layer from an optional mechanistic extension.</w:t>
       </w:r>
     </w:p>
     <w:p>
@@ -3141,7 +3170,7 @@
           <w:color w:val="000000"/>
           <w:sz w:val="20"/>
         </w:rPr>
-        <w:t xml:space="preserve"> may include NfL, genotype-specific MRI/MRS, eye movements, electrophysiology, and digital gait. </w:t>
+        <w:t xml:space="preserve"> may include neurofilament light chain (NfL), genotype-specific magnetic resonance imaging (MRI) and magnetic resonance spectroscopy (MRS), eye movements, electrophysiology, and digital gait. </w:t>
       </w:r>
       <m:oMath>
         <m:r>
@@ -4023,7 +4052,7 @@
           <w:color w:val="000000"/>
           <w:sz w:val="20"/>
         </w:rPr>
-        <w:t xml:space="preserve">, activation efficacy </w:t>
+        <w:t xml:space="preserve">, activation efficacy, and resource value. After normalization to candidate-specific reference scales, write the activation and useful-supply responses as </w:t>
       </w:r>
       <m:oMath>
         <m:sSub>
@@ -4032,7 +4061,7 @@
               <m:rPr>
                 <m:nor/>
               </m:rPr>
-              <m:t>a</m:t>
+              <m:t>A</m:t>
             </m:r>
           </m:e>
           <m:sub>
@@ -4040,10 +4069,34 @@
               <m:rPr>
                 <m:nor/>
               </m:rPr>
-              <m:t>iq</m:t>
+              <m:t>i</m:t>
             </m:r>
           </m:sub>
         </m:sSub>
+        <m:r>
+          <m:rPr>
+            <m:nor/>
+          </m:rPr>
+          <m:t>(</m:t>
+        </m:r>
+        <m:r>
+          <m:rPr>
+            <m:nor/>
+          </m:rPr>
+          <m:t> </m:t>
+        </m:r>
+        <m:r>
+          <m:rPr>
+            <m:nor/>
+          </m:rPr>
+          <m:t>X</m:t>
+        </m:r>
+        <m:r>
+          <m:rPr>
+            <m:nor/>
+          </m:rPr>
+          <m:t>)</m:t>
+        </m:r>
       </m:oMath>
       <w:r>
         <w:rPr>
@@ -4052,7 +4105,7 @@
           <w:color w:val="000000"/>
           <w:sz w:val="20"/>
         </w:rPr>
-        <w:t xml:space="preserve">, and resource value </w:t>
+        <w:t xml:space="preserve"> and </w:t>
       </w:r>
       <m:oMath>
         <m:sSub>
@@ -4061,7 +4114,7 @@
               <m:rPr>
                 <m:nor/>
               </m:rPr>
-              <m:t>w</m:t>
+              <m:t>U</m:t>
             </m:r>
           </m:e>
           <m:sub>
@@ -4073,6 +4126,30 @@
             </m:r>
           </m:sub>
         </m:sSub>
+        <m:r>
+          <m:rPr>
+            <m:nor/>
+          </m:rPr>
+          <m:t>(</m:t>
+        </m:r>
+        <m:r>
+          <m:rPr>
+            <m:nor/>
+          </m:rPr>
+          <m:t> </m:t>
+        </m:r>
+        <m:r>
+          <m:rPr>
+            <m:nor/>
+          </m:rPr>
+          <m:t>X</m:t>
+        </m:r>
+        <m:r>
+          <m:rPr>
+            <m:nor/>
+          </m:rPr>
+          <m:t>)</m:t>
+        </m:r>
       </m:oMath>
       <w:r>
         <w:rPr>
@@ -4081,7 +4158,7 @@
           <w:color w:val="000000"/>
           <w:sz w:val="20"/>
         </w:rPr>
-        <w:t>. The key theoretical condition is not a fixed “quality ratio,” but the possibility that activation rises faster than useful supply:</w:t>
+        <w:t>. The key theoretical condition is not a dimensionally ambiguous fixed “quality ratio,” but a prespecified interval in which activation gain exceeds useful-supply gain:</w:t>
       </w:r>
     </w:p>
     <w:p>
@@ -4091,126 +4168,126 @@
         <w:jc w:val="center"/>
       </w:pPr>
       <m:oMath>
-        <m:sSub>
-          <m:e>
+        <m:f>
+          <m:num>
             <m:r>
               <m:rPr>
                 <m:nor/>
               </m:rPr>
-              <m:t>a</m:t>
+              <m:t>d</m:t>
             </m:r>
-          </m:e>
-          <m:sub>
             <m:r>
               <m:rPr>
                 <m:nor/>
               </m:rPr>
-              <m:t>iq</m:t>
+              <m:t> </m:t>
             </m:r>
-          </m:sub>
-        </m:sSub>
-        <m:r>
-          <m:rPr>
-            <m:nor/>
-          </m:rPr>
-          <m:t>≫</m:t>
-        </m:r>
-        <m:r>
-          <m:rPr>
-            <m:nor/>
-          </m:rPr>
-          <m:t> </m:t>
-        </m:r>
-        <m:sSub>
-          <m:e>
+            <m:sSub>
+              <m:e>
+                <m:r>
+                  <m:rPr>
+                    <m:nor/>
+                  </m:rPr>
+                  <m:t>A</m:t>
+                </m:r>
+              </m:e>
+              <m:sub>
+                <m:r>
+                  <m:rPr>
+                    <m:nor/>
+                  </m:rPr>
+                  <m:t>i</m:t>
+                </m:r>
+              </m:sub>
+            </m:sSub>
+          </m:num>
+          <m:den>
             <m:r>
               <m:rPr>
                 <m:nor/>
               </m:rPr>
-              <m:t>w</m:t>
+              <m:t>d</m:t>
             </m:r>
-          </m:e>
-          <m:sub>
             <m:r>
               <m:rPr>
                 <m:nor/>
               </m:rPr>
-              <m:t>q</m:t>
+              <m:t> </m:t>
             </m:r>
-          </m:sub>
-        </m:sSub>
+            <m:r>
+              <m:rPr>
+                <m:nor/>
+              </m:rPr>
+              <m:t>X</m:t>
+            </m:r>
+          </m:den>
+        </m:f>
+        <m:r>
+          <m:rPr>
+            <m:nor/>
+          </m:rPr>
+          <m:t>&gt;</m:t>
+        </m:r>
         <m:r>
           <m:rPr>
             <m:nor/>
           </m:rPr>
           <m:t> </m:t>
         </m:r>
-        <m:r>
-          <m:rPr>
-            <m:nor/>
-          </m:rPr>
-          <m:t>over</m:t>
-        </m:r>
-        <m:r>
-          <m:rPr>
-            <m:nor/>
-          </m:rPr>
-          <m:t> </m:t>
-        </m:r>
-        <m:r>
-          <m:rPr>
-            <m:nor/>
-          </m:rPr>
-          <m:t>part</m:t>
-        </m:r>
-        <m:r>
-          <m:rPr>
-            <m:nor/>
-          </m:rPr>
-          <m:t> </m:t>
-        </m:r>
-        <m:r>
-          <m:rPr>
-            <m:nor/>
-          </m:rPr>
-          <m:t>of</m:t>
-        </m:r>
-        <m:r>
-          <m:rPr>
-            <m:nor/>
-          </m:rPr>
-          <m:t> </m:t>
-        </m:r>
-        <m:r>
-          <m:rPr>
-            <m:nor/>
-          </m:rPr>
-          <m:t>the</m:t>
-        </m:r>
-        <m:r>
-          <m:rPr>
-            <m:nor/>
-          </m:rPr>
-          <m:t> </m:t>
-        </m:r>
-        <m:r>
-          <m:rPr>
-            <m:nor/>
-          </m:rPr>
-          <m:t>exposure</m:t>
-        </m:r>
-        <m:r>
-          <m:rPr>
-            <m:nor/>
-          </m:rPr>
-          <m:t> </m:t>
-        </m:r>
-        <m:r>
-          <m:rPr>
-            <m:nor/>
-          </m:rPr>
-          <m:t>range</m:t>
-        </m:r>
+        <m:f>
+          <m:num>
+            <m:r>
+              <m:rPr>
+                <m:nor/>
+              </m:rPr>
+              <m:t>d</m:t>
+            </m:r>
+            <m:r>
+              <m:rPr>
+                <m:nor/>
+              </m:rPr>
+              <m:t> </m:t>
+            </m:r>
+            <m:sSub>
+              <m:e>
+                <m:r>
+                  <m:rPr>
+                    <m:nor/>
+                  </m:rPr>
+                  <m:t>U</m:t>
+                </m:r>
+              </m:e>
+              <m:sub>
+                <m:r>
+                  <m:rPr>
+                    <m:nor/>
+                  </m:rPr>
+                  <m:t>q</m:t>
+                </m:r>
+              </m:sub>
+            </m:sSub>
+          </m:num>
+          <m:den>
+            <m:r>
+              <m:rPr>
+                <m:nor/>
+              </m:rPr>
+              <m:t>d</m:t>
+            </m:r>
+            <m:r>
+              <m:rPr>
+                <m:nor/>
+              </m:rPr>
+              <m:t> </m:t>
+            </m:r>
+            <m:r>
+              <m:rPr>
+                <m:nor/>
+              </m:rPr>
+              <m:t>X</m:t>
+            </m:r>
+          </m:den>
+        </m:f>
         <m:r>
           <m:rPr>
             <m:nor/>
@@ -4218,6 +4295,21 @@
           <m:t>.</m:t>
         </m:r>
       </m:oMath>
+    </w:p>
+    <w:p>
+      <w:pPr>
+        <w:keepLines w:val="0"/>
+        <w:jc w:val="both"/>
+      </w:pPr>
+      <w:r>
+        <w:rPr>
+          <w:rFonts w:ascii="Times New Roman" w:hAnsi="Times New Roman" w:eastAsia="Times New Roman"/>
+          <w:b w:val="0"/>
+          <w:color w:val="000000"/>
+          <w:sz w:val="20"/>
+        </w:rPr>
+        <w:t>The normalization, comparison interval, and candidate-specific measurements must be declared before outcome analysis.</w:t>
+      </w:r>
     </w:p>
     <w:p>
       <w:pPr>
@@ -4477,7 +4569,7 @@
           <w:color w:val="000000"/>
           <w:sz w:val="20"/>
         </w:rPr>
-        <w:t xml:space="preserve">with a constant genetic/age drain. The parameters are chosen to display the hypothesized shape; they are not fitted to patients and have no dose interpretation. Figure 2 adopts </w:t>
+        <w:t xml:space="preserve">with a constant genetic/age drain. We chose the parameters to display the hypothesized shape; they are not fitted to patients and have no dose interpretation. Figure 2 adopts </w:t>
       </w:r>
       <m:oMath>
         <m:r>
@@ -4697,7 +4789,7 @@
       <w:r>
         <w:drawing>
           <wp:inline xmlns:a="http://schemas.openxmlformats.org/drawingml/2006/main" xmlns:pic="http://schemas.openxmlformats.org/drawingml/2006/picture">
-            <wp:extent cx="5760720" cy="4884930"/>
+            <wp:extent cx="5760720" cy="4875509"/>
             <wp:docPr id="2" name="Picture 2" descr="Illustrative non-monotonic curve"/>
             <wp:cNvGraphicFramePr>
               <a:graphicFrameLocks noChangeAspect="1"/>
@@ -4718,7 +4810,7 @@
                   <pic:spPr>
                     <a:xfrm>
                       <a:off x="0" y="0"/>
-                      <a:ext cx="5760720" cy="4884930"/>
+                      <a:ext cx="5760720" cy="4875509"/>
                     </a:xfrm>
                     <a:prstGeom prst="rect"/>
                   </pic:spPr>
@@ -4740,7 +4832,7 @@
           <w:color w:val="000000"/>
           <w:sz w:val="18"/>
         </w:rPr>
-        <w:t>Figure 2. A predicted non-monotonic response under one illustrative parameter set.</w:t>
+        <w:t>Fig. 2</w:t>
       </w:r>
       <w:r>
         <w:rPr>
@@ -4749,7 +4841,7 @@
           <w:color w:val="000000"/>
           <w:sz w:val="18"/>
         </w:rPr>
-        <w:t xml:space="preserve"> The horizontal axis is the hypothetical input </w:t>
+        <w:t xml:space="preserve"> A predicted non-monotonic response under one illustrative parameter set. The horizontal axis is the hypothetical input </w:t>
       </w:r>
       <m:oMath>
         <m:r>
@@ -4795,7 +4887,7 @@
           <w:color w:val="000000"/>
           <w:sz w:val="18"/>
         </w:rPr>
-        <w:t xml:space="preserve"> is used only for this illustration. At very low input, activation and exchange are small, producing an idle state with limited replenishment but limited activation-linked loss. At intermediate input, activation and outward loss can exceed uptake, creating maximal modeled depletion. At sufficiently high input, uptake dominates and net balance is restored. Every curve, boundary, and parameter is illustrative. No human SCA dataset currently demonstrates these four zones.</w:t>
+        <w:t xml:space="preserve"> is used only for this illustration. At very low input, activation and exchange are small, producing an idle state with limited replenishment but limited activation-linked loss. At intermediate input, activation and outward loss can exceed uptake, creating maximal modeled depletion. At sufficiently high input, uptake dominates and net balance is restored. Every curve, boundary, and parameter is illustrative. The human SCA evidence reviewed here does not demonstrate these four zones</w:t>
       </w:r>
     </w:p>
     <w:p>
@@ -5216,7 +5308,7 @@
           <w:color w:val="000000"/>
           <w:sz w:val="20"/>
         </w:rPr>
-        <w:t xml:space="preserve">, uptake, or leakage. A later gate-specific mechanistic substudy would need at least three independently measured axes: an activation marker </w:t>
+        <w:t xml:space="preserve">, uptake, or outward loss. A later gate-specific mechanistic substudy would need at least three independently measured axes: an activation marker </w:t>
       </w:r>
       <m:oMath>
         <m:r>
@@ -5301,7 +5393,7 @@
           <w:color w:val="000000"/>
           <w:sz w:val="20"/>
         </w:rPr>
-        <w:t xml:space="preserve"> fails to rise proportionally, and the reserve-proxy slope subsequently worsens before clinical change. A perturbation that selectively changes the proposed gate or activation process should then alter those ordered mediators and downstream biomarkers, with negative-control exposures and pathways remaining stable. Without this temporal and perturbational evidence, a hump plus genotype interaction supports only a non-linear environment model, not the proposed gate–leak mechanism.</w:t>
+        <w:t xml:space="preserve"> fails to rise proportionally, and the reserve-proxy slope subsequently worsens before clinical change. A perturbation that selectively changes the proposed gate or activation process should then alter those ordered mediators and downstream biomarkers, with negative-control exposures and pathways remaining stable. Without this temporal and perturbational evidence, a hump plus genotype interaction supports only a non-linear environment model, not the proposed gate–loss mechanism.</w:t>
       </w:r>
     </w:p>
     <w:p>
@@ -5344,7 +5436,7 @@
           <w:color w:val="000000"/>
           <w:sz w:val="20"/>
         </w:rPr>
-        <w:t xml:space="preserve">An SCA6 mouse study reported that ER/proteostasis stress and an HSP90-dependent unfolded-protein response preceded later hyperexcitability and motor impairment [7]. This is a useful analogy for early pathogenic pressure plus temporary resilience. It does not demonstrate a finite external reserve </w:t>
+        <w:t xml:space="preserve">An SCA6 mouse study reported that endoplasmic reticulum (ER)/proteostasis stress and an HSP90-dependent unfolded-protein response preceded later hyperexcitability and motor impairment [7]. This is a useful analogy for early pathogenic pressure plus temporary resilience. It does not demonstrate a finite external reserve </w:t>
       </w:r>
       <m:oMath>
         <m:r>
@@ -5440,7 +5532,7 @@
           <w:color w:val="000000"/>
           <w:sz w:val="20"/>
         </w:rPr>
-        <w:t>In Sca1 mice, molecular-layer interneuron hyperactivity preceded overt Purkinje neuron degeneration; chemogenetic suppression improved calcium signalling, delayed degeneration, and improved motor outcomes, whereas inducing related hyperactivity in healthy mice generated aspects of pathology [9]. This is the strongest experimental analogy for an early pathological “downshift.” The causal evidence is in mice, not in human cerebellar circuits.</w:t>
+        <w:t>In Sca1 mice, molecular-layer interneuron (MLIN) hyperactivity preceded overt Purkinje neuron degeneration; chemogenetic suppression improved calcium signalling, delayed degeneration, and improved motor outcomes, whereas inducing related hyperactivity in healthy mice generated aspects of pathology [9]. This is the strongest experimental analogy for an early pathological “downshift.” The causal evidence is in mice, not in human cerebellar circuits.</w:t>
       </w:r>
     </w:p>
     <w:p>
@@ -5501,7 +5593,7 @@
           <w:color w:val="000000"/>
           <w:sz w:val="20"/>
         </w:rPr>
-        <w:t>A mouse model carrying the patient-associated GRM1 p.Y792C gain-of-function variant developed progressive motor and region-specific Purkinje-cell abnormalities [12]. A 2026 study of the moonwalker TRPC3 variant and the cerebellum-enriched Δ28 isoform found constitutive channel activity and calcium-dependent cell death in HEK293 cells; co-expression of Purkinje-enriched PMCA2 partly rescued survival in that cell system [13]. The latter was not an in-vivo Purkinje-cell rescue. Together, these studies show that “more activity” is not automatically beneficial. They do not establish a universal hyperactive subtype or justify blanket circuit inhibition.</w:t>
+        <w:t>A mouse model carrying the patient-associated GRM1 p.Y792C gain-of-function variant developed progressive motor and region-specific Purkinje-cell abnormalities [12]. A 2026 study of the moonwalker TRPC3 variant and the cerebellum-enriched Δ28 isoform found constitutive channel activity and calcium-dependent cell death in human embryonic kidney 293 (HEK293) cells; co-expression of Purkinje-enriched plasma-membrane Ca²⁺-ATPase 2 (PMCA2) partly rescued survival in that cell system [13]. The latter was not an in-vivo Purkinje-cell rescue. Together, these studies show that “more activity” is not automatically beneficial. They do not establish a universal hyperactive subtype or justify blanket circuit inhibition.</w:t>
       </w:r>
     </w:p>
     <w:p>
@@ -5545,7 +5637,7 @@
           <w:color w:val="000000"/>
           <w:sz w:val="20"/>
         </w:rPr>
-        <w:t xml:space="preserve">Likewise, purified human GluD2 reconstituted in artificial DPHPC lipid bilayers displayed D-serine- and GABA-gated currents [16]. Under 10 mM D-serine, reported open probability was </w:t>
+        <w:t xml:space="preserve">Likewise, purified human GluD2 reconstituted in artificial 1,2-diphytanoyl-sn-glycero-3-phosphocholine (DPHPC) lipid bilayers displayed D-serine- and γ-aminobutyric acid (GABA)-gated currents [16]. Under 10 mM D-serine, reported open probability was </w:t>
       </w:r>
       <m:oMath>
         <m:r>
@@ -5709,7 +5801,7 @@
           <w:color w:val="000000"/>
           <w:sz w:val="20"/>
         </w:rPr>
-        <w:t>NfL is elevated before manifest ataxia in SCA3 cohorts, including two multicentre cohorts in which abnormality was estimated several years before expected onset [17]. Longitudinal ESMI data in 291 carriers and 121 controls found stage-dependent changes in NfL and MRI, with pons volume showing high responsiveness across stages [18]. These results support trial enrichment and disease-activity measurement, but NfL and MRI are not established surrogate endpoints for clinical benefit.</w:t>
+        <w:t>NfL is elevated before manifest ataxia in SCA3 cohorts, including two multicentre cohorts in which abnormality was estimated several years before expected onset [17]. Longitudinal data from a multicentre cohort of 291 carriers and 121 controls showed stage-dependent changes in NfL and MRI, with pons volume showing high responsiveness across stages [18]. These results support trial enrichment and disease-activity measurement, but NfL and MRI are not established surrogate endpoints for clinical benefit.</w:t>
       </w:r>
     </w:p>
     <w:p>
@@ -5724,7 +5816,7 @@
           <w:color w:val="000000"/>
           <w:sz w:val="20"/>
         </w:rPr>
-        <w:t>A 2026 four-centre MRS study in 18 SCA2 participants, 25 SCA3 participants, and 29 controls found reproducible neurochemical differences over short retest intervals; estimates required site/vendor adjustment and differed by genotype [19]. It was not a presymptomatic longitudinal prediction study. MRS should therefore remain genotype-specific and generally secondary until responsiveness and clinical meaning are established.</w:t>
+        <w:t>A 2026 four-centre MRS study in 18 SCA2 participants, 25 SCA3 participants, and 29 controls found reproducible neurochemical differences over short retest intervals; estimates required site/vendor adjustment and differed by genotype [19]. It was not a preataxic longitudinal prediction study. MRS should therefore remain genotype-specific and generally secondary until responsiveness and clinical meaning are established.</w:t>
       </w:r>
     </w:p>
     <w:p>
@@ -5768,7 +5860,7 @@
           <w:color w:val="000000"/>
           <w:sz w:val="20"/>
         </w:rPr>
-        <w:t xml:space="preserve">An exploratory study of 188 SCA3/MJD participants from 109 families associated municipality-level rural proxies with approximately 1.8 years earlier residual age at onset [20]. The variables were 2010 ecological proxies—population density, rural population proportion, and untreated-well-water proportion—rather than individual lifetime exposures. They were correlated, median-dichotomized, and only marginally significant. The study did not measure </w:t>
+        <w:t xml:space="preserve">An exploratory analysis found that municipality-level rural proxies were associated with approximately 1.8 years earlier residual age at onset among 188 SCA3/MJD participants from 109 families [20]. The variables were 2010 ecological proxies—population density, rural population proportion, and untreated-well-water proportion—rather than individual lifetime exposures. They were correlated, median-dichotomized, and only marginally significant. The study did not measure </w:t>
       </w:r>
       <m:oMath>
         <m:r>
@@ -5831,7 +5923,7 @@
           <w:color w:val="000000"/>
           <w:sz w:val="20"/>
         </w:rPr>
-        <w:t>A randomized crossover study of 20 people with mixed neurodegenerative ataxias reported clinical and physiological improvements after a cerebellar-anodal/spinal-cathodal montage [21]. A separate randomized study in 20 people with SCA3 found that two weeks of cerebellar anodal tDCS did not improve SARA or cerebellar brain inhibition relative to sham [22]. Neither study selected a validated hyperactive subtype, and anodal tDCS cannot be equated with biological “downshifting.” This mixed record supports phenotype-first target validation, not immediate therapeutic generalization.</w:t>
+        <w:t>A randomized crossover study of 20 people with mixed neurodegenerative ataxias reported clinical and physiological improvements after a cerebellar-anodal/spinal-cathodal transcranial direct-current stimulation (tDCS) montage [21]. A separate randomized study in 20 people with SCA3 found that two weeks of cerebellar anodal tDCS did not improve the Scale for the Assessment and Rating of Ataxia (SARA) or cerebellar brain inhibition relative to sham [22]. Neither study selected a validated hyperactive subtype, and anodal tDCS cannot be equated with biological “downshifting.” This mixed record supports phenotype-first target validation, not immediate therapeutic generalization.</w:t>
       </w:r>
     </w:p>
     <w:p>
@@ -6106,6 +6198,38 @@
     </w:p>
     <w:p>
       <w:pPr>
+        <w:keepLines w:val="0"/>
+        <w:jc w:val="both"/>
+      </w:pPr>
+      <w:r>
+        <w:rPr>
+          <w:rFonts w:ascii="Times New Roman" w:hAnsi="Times New Roman" w:eastAsia="Times New Roman"/>
+          <w:b w:val="0"/>
+          <w:color w:val="000000"/>
+          <w:sz w:val="20"/>
+        </w:rPr>
+        <w:t xml:space="preserve">For the primary SCA3 phenoconversion analysis, </w:t>
+      </w:r>
+      <m:oMath>
+        <m:r>
+          <m:rPr>
+            <m:nor/>
+          </m:rPr>
+          <m:t>f</m:t>
+        </m:r>
+      </m:oMath>
+      <w:r>
+        <w:rPr>
+          <w:rFonts w:ascii="Times New Roman" w:hAnsi="Times New Roman" w:eastAsia="Times New Roman"/>
+          <w:b w:val="0"/>
+          <w:color w:val="000000"/>
+          <w:sz w:val="20"/>
+        </w:rPr>
+        <w:t xml:space="preserve"> is the prespecified fitted log-hazard curve. Any use of this contrast for a biomarker or functional outcome requires a separately frozen outcome scale and model.</w:t>
+      </w:r>
+    </w:p>
+    <w:p>
+      <w:pPr>
         <w:pStyle w:val="Heading2"/>
       </w:pPr>
       <w:r>
@@ -6334,11 +6458,20 @@
       <w:r>
         <w:rPr>
           <w:rFonts w:ascii="Times New Roman" w:hAnsi="Times New Roman" w:eastAsia="Times New Roman"/>
+          <w:b/>
+          <w:color w:val="000000"/>
+          <w:sz w:val="20"/>
+        </w:rPr>
+        <w:t>Supplementary Material 1</w:t>
+      </w:r>
+      <w:r>
+        <w:rPr>
+          <w:rFonts w:ascii="Times New Roman" w:hAnsi="Times New Roman" w:eastAsia="Times New Roman"/>
           <w:b w:val="0"/>
           <w:color w:val="000000"/>
           <w:sz w:val="20"/>
         </w:rPr>
-        <w:t>The complete protocol and statistical analysis plan are provided separately: prospective cohort and SAP.</w:t>
+        <w:t xml:space="preserve"> and the public repository identified on the title page contain the complete prospective-cohort protocol, statistical analysis plan, and target-specific early-intervention concepts.</w:t>
       </w:r>
     </w:p>
     <w:p>
@@ -6774,7 +6907,7 @@
           <w:color w:val="000000"/>
           <w:sz w:val="20"/>
         </w:rPr>
-        <w:t xml:space="preserve">The candidate </w:t>
+        <w:t xml:space="preserve">We construct the candidate </w:t>
       </w:r>
       <m:oMath>
         <m:r>
@@ -6809,7 +6942,7 @@
           <w:color w:val="000000"/>
           <w:sz w:val="20"/>
         </w:rPr>
-        <w:t xml:space="preserve"> is built without SARA to prevent circular prediction. A longitudinal factor model uses NfL, genotype-specific MRI/MRS, ocular-motor physiology, and digital measures; it tests site/genotype measurement invariance, uses cross-validation, and then predicts phenoconversion and functional decline. The model is abandoned if it is unstable, merely reproduces NfL, or does not improve external prediction. Predictive gain for </w:t>
+        <w:t xml:space="preserve"> without SARA to prevent circular prediction. A longitudinal factor model uses NfL, genotype-specific MRI/MRS, ocular-motor physiology, and digital measures; it tests site/genotype measurement invariance, uses cross-validation, and then predicts phenoconversion and functional decline. The model is abandoned if it is unstable, merely reproduces NfL, or does not improve external prediction. Predictive gain for </w:t>
       </w:r>
       <m:oMath>
         <m:r>
@@ -6872,7 +7005,25 @@
           <w:color w:val="000000"/>
           <w:sz w:val="20"/>
         </w:rPr>
-        <w:t xml:space="preserve">The trial concepts deliberately separate SCA3 and SCA6. They illustrate early modifiability of known targets; they neither test nor validate </w:t>
+        <w:t xml:space="preserve">The trial concepts in </w:t>
+      </w:r>
+      <w:r>
+        <w:rPr>
+          <w:rFonts w:ascii="Times New Roman" w:hAnsi="Times New Roman" w:eastAsia="Times New Roman"/>
+          <w:b/>
+          <w:color w:val="000000"/>
+          <w:sz w:val="20"/>
+        </w:rPr>
+        <w:t>Supplementary Material 1</w:t>
+      </w:r>
+      <w:r>
+        <w:rPr>
+          <w:rFonts w:ascii="Times New Roman" w:hAnsi="Times New Roman" w:eastAsia="Times New Roman"/>
+          <w:b w:val="0"/>
+          <w:color w:val="000000"/>
+          <w:sz w:val="20"/>
+        </w:rPr>
+        <w:t xml:space="preserve"> deliberately separate SCA3 and SCA6. They illustrate early modifiability of known targets; they neither test nor validate </w:t>
       </w:r>
       <m:oMath>
         <m:r>
@@ -6918,7 +7069,7 @@
       <w:r>
         <w:drawing>
           <wp:inline xmlns:a="http://schemas.openxmlformats.org/drawingml/2006/main" xmlns:pic="http://schemas.openxmlformats.org/drawingml/2006/picture">
-            <wp:extent cx="5760720" cy="3796771"/>
+            <wp:extent cx="5760720" cy="3615532"/>
             <wp:docPr id="3" name="Picture 3" descr="Prospective validation and trial gates"/>
             <wp:cNvGraphicFramePr>
               <a:graphicFrameLocks noChangeAspect="1"/>
@@ -6939,7 +7090,7 @@
                   <pic:spPr>
                     <a:xfrm>
                       <a:off x="0" y="0"/>
-                      <a:ext cx="5760720" cy="3796771"/>
+                      <a:ext cx="5760720" cy="3615532"/>
                     </a:xfrm>
                     <a:prstGeom prst="rect"/>
                   </pic:spPr>
@@ -6961,7 +7112,7 @@
           <w:color w:val="000000"/>
           <w:sz w:val="18"/>
         </w:rPr>
-        <w:t>Figure 3. Prospective validation and gated early-intervention programme.</w:t>
+        <w:t>Fig. 3</w:t>
       </w:r>
       <w:r>
         <w:rPr>
@@ -6970,7 +7121,7 @@
           <w:color w:val="000000"/>
           <w:sz w:val="18"/>
         </w:rPr>
-        <w:t xml:space="preserve"> A shared natural-history and measurement core feeds separate genotype- and target-specific examples. The SCA3 and SCA6 concepts test known targets, not the unknown input. The circuit module stays inactive until prospective human evidence meets four gates. A failed cohort signal stops model escalation and cannot be repaired by redefining </w:t>
+        <w:t xml:space="preserve"> Prospective validation and gated early-intervention programme. A shared natural-history and measurement core feeds separate genotype- and target-specific examples. The SCA3 and SCA6 concepts test known targets, not the unknown input. The circuit module stays inactive until prospective human evidence meets four gates. A failed cohort signal stops model escalation and cannot be repaired by redefining </w:t>
       </w:r>
       <m:oMath>
         <m:r>
@@ -7021,7 +7172,54 @@
           <w:color w:val="000000"/>
           <w:sz w:val="18"/>
         </w:rPr>
-        <w:t>.</w:t>
+        <w:t xml:space="preserve">. 5-y, five-year; CSF, cerebrospinal fluid; f-SARA, functional SARA; </w:t>
+      </w:r>
+      <m:oMath>
+        <m:r>
+          <m:rPr>
+            <m:nor/>
+          </m:rPr>
+          <m:t>G</m:t>
+        </m:r>
+        <m:r>
+          <m:rPr>
+            <m:nor/>
+          </m:rPr>
+          <m:t>×</m:t>
+        </m:r>
+        <m:r>
+          <m:rPr>
+            <m:nor/>
+          </m:rPr>
+          <m:t> </m:t>
+        </m:r>
+        <m:sSup>
+          <m:e>
+            <m:r>
+              <m:rPr>
+                <m:nor/>
+              </m:rPr>
+              <m:t>S</m:t>
+            </m:r>
+          </m:e>
+          <m:sup>
+            <m:r>
+              <m:rPr>
+                <m:nor/>
+              </m:rPr>
+              <m:t>*</m:t>
+            </m:r>
+          </m:sup>
+        </m:sSup>
+      </m:oMath>
+      <w:r>
+        <w:rPr>
+          <w:rFonts w:ascii="Times New Roman" w:hAnsi="Times New Roman" w:eastAsia="Times New Roman"/>
+          <w:b w:val="0"/>
+          <w:color w:val="000000"/>
+          <w:sz w:val="18"/>
+        </w:rPr>
+        <w:t>, genotype-by-score interaction; H1, prespecified SCA3 hump contrast; NfL, neurofilament light chain; MRI, magnetic resonance imaging; MRS, magnetic resonance spectroscopy; PRO, patient-reported outcome; SARA, Scale for the Assessment and Rating of Ataxia; SCA, spinocerebellar ataxia</w:t>
       </w:r>
     </w:p>
     <w:p>
@@ -7050,7 +7248,7 @@
           <w:color w:val="000000"/>
           <w:sz w:val="20"/>
         </w:rPr>
-        <w:t>Allele-specific ASO proof-of-concept in SCA3 patient-derived neurons reduced mutant ataxin-3 for one linked-SNP strategy while largely preserving wild type [23]. A different CAG-repeat-targeting strategy, VO659, is registered in an open-label phase 1/2a study with no posted SCA efficacy result at the evidence cut-off [24]. These observations justify conditional, target-engagement-led development after agent-specific human safety and dose information; they do not establish clinical benefit. Intrathecal lowering is dose-adjustable but not rapidly reversible and should not be described as a circuit downshift.</w:t>
+        <w:t>Allele-specific antisense oligonucleotide (ASO) proof-of-concept in SCA3 patient-derived neurons reduced mutant ataxin-3 for one linked single-nucleotide polymorphism (SNP) strategy while largely preserving wild type [23]. A different CAG-repeat-targeting strategy, VO659, is registered in an open-label phase 1/2a study with no posted SCA efficacy result at the evidence cut-off [24]. These observations justify conditional, target-engagement-led development after agent-specific human safety and dose information; they do not establish clinical benefit. Intrathecal lowering is dose-adjustable but not rapidly reversible and should not be described as a circuit downshift.</w:t>
       </w:r>
     </w:p>
     <w:p>
@@ -7131,48 +7329,7 @@
           <w:color w:val="000000"/>
           <w:sz w:val="20"/>
         </w:rPr>
-        <w:t xml:space="preserve">the human hyperactivity classifier has test–retest reliability </w:t>
-      </w:r>
-      <m:oMath>
-        <m:r>
-          <m:rPr>
-            <m:nor/>
-          </m:rPr>
-          <m:t>ICC</m:t>
-        </m:r>
-        <m:r>
-          <m:rPr>
-            <m:nor/>
-          </m:rPr>
-          <m:t>≥</m:t>
-        </m:r>
-        <m:r>
-          <m:rPr>
-            <m:nor/>
-          </m:rPr>
-          <m:t>0</m:t>
-        </m:r>
-        <m:r>
-          <m:rPr>
-            <m:nor/>
-          </m:rPr>
-          <m:t>.</m:t>
-        </m:r>
-        <m:r>
-          <m:rPr>
-            <m:nor/>
-          </m:rPr>
-          <m:t>75</m:t>
-        </m:r>
-      </m:oMath>
-      <w:r>
-        <w:rPr>
-          <w:rFonts w:ascii="Times New Roman" w:hAnsi="Times New Roman" w:eastAsia="Times New Roman"/>
-          <w:b w:val="0"/>
-          <w:color w:val="000000"/>
-          <w:sz w:val="20"/>
-        </w:rPr>
-        <w:t>;</w:t>
+        <w:t>the human hyperactivity classifier has a test–retest intraclass correlation coefficient (ICC) of at least 0.75;</w:t>
       </w:r>
     </w:p>
     <w:p>
@@ -7256,7 +7413,7 @@
           <w:color w:val="000000"/>
           <w:sz w:val="20"/>
         </w:rPr>
-        <w:t>The first primary endpoint is target engagement and washout reversibility, not SARA or disease modification. “Downshift” always means selective, reversible, pathology-specific modulation; it never means structural injury or destruction.</w:t>
+        <w:t>The primary endpoint of an initial phase 0 study would be target engagement and washout reversibility, not SARA or disease modification. “Downshift” always means selective, reversible, pathology-specific modulation; it never means structural injury or destruction.</w:t>
       </w:r>
     </w:p>
     <w:p>
@@ -7285,7 +7442,7 @@
           <w:color w:val="000000"/>
           <w:sz w:val="20"/>
         </w:rPr>
-        <w:t>The hypothesis is evaluated against three nested models:</w:t>
+        <w:t>We evaluate the hypothesis against three nested models:</w:t>
       </w:r>
     </w:p>
     <w:p>
@@ -7489,6 +7646,55 @@
           <w:color w:val="000000"/>
           <w:sz w:val="20"/>
         </w:rPr>
+        <w:t xml:space="preserve">These are prospective prediction models, not a causal adjustment sequence. Only biomarker information measured before the prediction horizon may enter </w:t>
+      </w:r>
+      <m:oMath>
+        <m:r>
+          <m:rPr>
+            <m:nor/>
+          </m:rPr>
+          <m:t>L</m:t>
+        </m:r>
+      </m:oMath>
+      <w:r>
+        <w:rPr>
+          <w:rFonts w:ascii="Times New Roman" w:hAnsi="Times New Roman" w:eastAsia="Times New Roman"/>
+          <w:b w:val="0"/>
+          <w:color w:val="000000"/>
+          <w:sz w:val="20"/>
+        </w:rPr>
+        <w:t xml:space="preserve">, and the primary H1 total-association analysis is estimated separately without conditioning on a potentially mediating </w:t>
+      </w:r>
+      <m:oMath>
+        <m:r>
+          <m:rPr>
+            <m:nor/>
+          </m:rPr>
+          <m:t>L</m:t>
+        </m:r>
+      </m:oMath>
+      <w:r>
+        <w:rPr>
+          <w:rFonts w:ascii="Times New Roman" w:hAnsi="Times New Roman" w:eastAsia="Times New Roman"/>
+          <w:b w:val="0"/>
+          <w:color w:val="000000"/>
+          <w:sz w:val="20"/>
+        </w:rPr>
+        <w:t>.</w:t>
+      </w:r>
+    </w:p>
+    <w:p>
+      <w:pPr>
+        <w:keepLines w:val="0"/>
+        <w:jc w:val="both"/>
+      </w:pPr>
+      <w:r>
+        <w:rPr>
+          <w:rFonts w:ascii="Times New Roman" w:hAnsi="Times New Roman" w:eastAsia="Times New Roman"/>
+          <w:b w:val="0"/>
+          <w:color w:val="000000"/>
+          <w:sz w:val="20"/>
+        </w:rPr>
         <w:t xml:space="preserve">M2 is retained only if it improves calibration and predictive performance in held-out sites or cohorts, reproduces the direction of the central-versus-extremes contrast, and survives exposure-error and selection-bias sensitivity analyses. A lower information criterion in the development data is not enough. M2 does not identify </w:t>
       </w:r>
       <m:oMath>
@@ -7523,7 +7729,7 @@
           <w:color w:val="000000"/>
           <w:sz w:val="20"/>
         </w:rPr>
-        <w:t>, uptake, or leakage. Gate-specific language requires the independent activation–uptake–reserve sequence and perturbational evidence defined above.</w:t>
+        <w:t>, uptake, or outward loss. Gate-specific language requires the independent activation–uptake–reserve sequence and perturbational evidence defined above.</w:t>
       </w:r>
     </w:p>
     <w:p>
@@ -7894,7 +8100,7 @@
           <w:color w:val="000000"/>
           <w:sz w:val="20"/>
         </w:rPr>
-        <w:t xml:space="preserve"> the broader layer is rejected when externally validated models containing known DNA repair, somatic expansion, established cerebellar reserve, HSP90/UPR, calcium, mitochondrial, synaptic, glial, and behavioural mechanisms match or outperform it without </w:t>
+        <w:t xml:space="preserve"> the broader layer is rejected when externally validated models containing known DNA repair, somatic expansion, established cerebellar reserve, HSP90-dependent unfolded-protein response, calcium, mitochondrial, synaptic, glial, and behavioural mechanisms match or outperform it without </w:t>
       </w:r>
       <m:oMath>
         <m:r>
@@ -7973,7 +8179,7 @@
           <w:color w:val="000000"/>
           <w:sz w:val="20"/>
         </w:rPr>
-        <w:t>The unknown input has no established identity, dose, delivery route, or safety profile. Clinicians and patients must not administer X, unvalidated electromagnetic fields, radiation, supplements, drugs, neural injury, or gene manipulation on the basis of this hypothesis. Observational exposure research should minimize disclosure risk from residential histories and avoid stigmatizing rural communities. Genetic-carrier recruitment requires counselling, privacy protection, and jurisdiction-specific handling of incidental and predictive findings.</w:t>
+        <w:t>The unknown input has no established identity, dose, delivery route, or safety profile. Clinicians and patients must not administer X, unvalidated electromagnetic fields, radiation, supplements, drugs, neural injury, or gene manipulation based on this hypothesis. Observational exposure research should minimize disclosure risk from residential histories and avoid stigmatizing rural communities. Genetic-carrier recruitment requires counselling, privacy protection, and jurisdiction-specific handling of incidental and predictive findings.</w:t>
       </w:r>
     </w:p>
     <w:p>
@@ -8078,7 +8284,7 @@
           <w:color w:val="000000"/>
           <w:sz w:val="20"/>
         </w:rPr>
-        <w:t>, a gate, outward leakage, or a hump-shaped human risk curve. The decisive next step is therefore not speculative treatment. It is an SCA3-led, preregistered test of a reliable measured exposure, followed by external replication and SCA6 transport testing. Gate-specific language requires the independent activation–uptake–reserve sequence and perturbation. If those tests fail, existing reserve and known molecular mechanisms should replace the added layer.</w:t>
+        <w:t>, a gate, outward loss, or a hump-shaped human risk curve. The decisive next step is therefore not speculative treatment. It is an SCA3-led, preregistered test of a reliable measured exposure, followed by external replication and SCA6 transport testing. Gate-specific language requires the independent activation–uptake–reserve sequence and perturbation. If those tests fail, existing reserve and known molecular mechanisms should replace the added layer.</w:t>
       </w:r>
     </w:p>
     <w:p>
@@ -8121,7 +8327,7 @@
           <w:color w:val="000000"/>
           <w:sz w:val="20"/>
         </w:rPr>
-        <w:t>This article contains no participant-level data. Figure source, deterministic sample-size scenarios, protocols, evidence audit, and repository checks are public in the repository identified on the title page. Trial concepts follow the logic of SPIRIT 2025, CONSORT 2025, and ICH E9(R1), but they are not substitutes for a sponsor-approved final protocol or SAP.</w:t>
+        <w:t>This article contains no participant-level data. Figure source, deterministic sample-size scenarios, protocols, evidence audit, and repository checks are public in the repository identified on the title page. The figures were generated programmatically with Python and Matplotlib; source code and vector exports are provided in that repository. Trial concepts follow the logic of SPIRIT 2025, CONSORT 2025, and ICH E9(R1), but they are not substitutes for a sponsor-approved final protocol or statistical analysis plan (SAP).</w:t>
       </w:r>
     </w:p>
     <w:p>
@@ -8193,7 +8399,7 @@
           <w:color w:val="000000"/>
           <w:sz w:val="22"/>
         </w:rPr>
-        <w:t>Funding</w:t>
+        <w:t>Acknowledgements</w:t>
       </w:r>
     </w:p>
     <w:p>
@@ -8208,7 +8414,7 @@
           <w:color w:val="000000"/>
           <w:sz w:val="20"/>
         </w:rPr>
-        <w:t>This work received no external funding.</w:t>
+        <w:t>None.</w:t>
       </w:r>
     </w:p>
     <w:p>
@@ -8222,7 +8428,7 @@
           <w:color w:val="000000"/>
           <w:sz w:val="22"/>
         </w:rPr>
-        <w:t>Competing interests</w:t>
+        <w:t>Funding</w:t>
       </w:r>
     </w:p>
     <w:p>
@@ -8237,7 +8443,7 @@
           <w:color w:val="000000"/>
           <w:sz w:val="20"/>
         </w:rPr>
-        <w:t>The author declares no competing interests. The author retains copyright in the associated public repository and may consider future commercial-licensing requests. No commercial funding or payment was received for this work.</w:t>
+        <w:t>This work received no external funding.</w:t>
       </w:r>
     </w:p>
     <w:p>
@@ -8251,7 +8457,7 @@
           <w:color w:val="000000"/>
           <w:sz w:val="22"/>
         </w:rPr>
-        <w:t>AI-assisted tools</w:t>
+        <w:t>Competing interests</w:t>
       </w:r>
     </w:p>
     <w:p>
@@ -8266,25 +8472,54 @@
           <w:color w:val="000000"/>
           <w:sz w:val="20"/>
         </w:rPr>
-        <w:t>OpenAI Codex was used as an AI-assisted tool for literature organization, drafting and language editing, code generation for figures and repository checks, and internal consistency review. It is not an author. The named author remains responsible for source verification, scientific claims, analyses, disclosures, and the submitted version.</w:t>
+        <w:t>The author declares no competing interests. The author retains copyright in the associated public repository and may consider future commercial-licensing requests. No commercial funding or payment was received for this work.</w:t>
       </w:r>
     </w:p>
     <w:p>
       <w:pPr>
-        <w:pStyle w:val="Heading1"/>
+        <w:pStyle w:val="Heading2"/>
       </w:pPr>
       <w:r>
         <w:rPr>
           <w:rFonts w:ascii="Times New Roman" w:hAnsi="Times New Roman" w:eastAsia="Times New Roman"/>
           <w:b/>
           <w:color w:val="000000"/>
-          <w:sz w:val="24"/>
-        </w:rPr>
-        <w:t>References</w:t>
+          <w:sz w:val="22"/>
+        </w:rPr>
+        <w:t>AI-assisted tools</w:t>
       </w:r>
     </w:p>
     <w:p>
       <w:pPr>
+        <w:keepLines w:val="0"/>
+        <w:jc w:val="both"/>
+      </w:pPr>
+      <w:r>
+        <w:rPr>
+          <w:rFonts w:ascii="Times New Roman" w:hAnsi="Times New Roman" w:eastAsia="Times New Roman"/>
+          <w:b w:val="0"/>
+          <w:color w:val="000000"/>
+          <w:sz w:val="20"/>
+        </w:rPr>
+        <w:t>OpenAI Codex was used as an AI-assisted tool for literature organization, drafting and language editing, code generation for figures and repository checks, and internal consistency review. It is not an author. The named author remains responsible for source verification, scientific claims, analyses, disclosures, and the submitted version.</w:t>
+      </w:r>
+    </w:p>
+    <w:p>
+      <w:pPr>
+        <w:pStyle w:val="Heading1"/>
+      </w:pPr>
+      <w:r>
+        <w:rPr>
+          <w:rFonts w:ascii="Times New Roman" w:hAnsi="Times New Roman" w:eastAsia="Times New Roman"/>
+          <w:b/>
+          <w:color w:val="000000"/>
+          <w:sz w:val="24"/>
+        </w:rPr>
+        <w:t>References</w:t>
+      </w:r>
+    </w:p>
+    <w:p>
+      <w:pPr>
         <w:spacing w:after="60" w:line="276" w:lineRule="auto"/>
         <w:ind w:left="360" w:hanging="259"/>
       </w:pPr>
@@ -8303,7 +8538,7 @@
           <w:color w:val="000000"/>
           <w:sz w:val="20"/>
         </w:rPr>
-        <w:t xml:space="preserve">Akçimen F, et al. Genome-wide association study identifies genetic factors that modify age at onset in Machado-Joseph disease. </w:t>
+        <w:t xml:space="preserve">Akçimen F, Martins S, Liao C, Bourassa CV, Catoire H, Nicholson GA, et al. Genome-wide association study identifies genetic factors that modify age at onset in Machado-Joseph disease. </w:t>
       </w:r>
       <w:r>
         <w:rPr>
@@ -8322,7 +8557,7 @@
           <w:color w:val="000000"/>
           <w:sz w:val="20"/>
         </w:rPr>
-        <w:t>. 2020. doi:10.18632/aging.102825.</w:t>
+        <w:t>. 2020;12(6):4742–4756. doi:10.18632/aging.102825.</w:t>
       </w:r>
     </w:p>
     <w:p>
@@ -8345,7 +8580,7 @@
           <w:color w:val="000000"/>
           <w:sz w:val="20"/>
         </w:rPr>
-        <w:t xml:space="preserve">Meyer CC, et al. Association of rare apolipoprotein E ε4 homozygosity with an earlier age at onset in spinocerebellar ataxia type 3. </w:t>
+        <w:t xml:space="preserve">Meyer CC, de Mattos EP, Burger RM, Blumenstock G, Pereira Sena P, Gordon C, et al. Association of rare apolipoprotein E ε4 homozygosity with an earlier age at onset in spinocerebellar ataxia type 3. </w:t>
       </w:r>
       <w:r>
         <w:rPr>
@@ -8355,7 +8590,7 @@
           <w:color w:val="000000"/>
           <w:sz w:val="20"/>
         </w:rPr>
-        <w:t>Human Molecular Genetics</w:t>
+        <w:t>Hum Mol Genet</w:t>
       </w:r>
       <w:r>
         <w:rPr>
@@ -8364,7 +8599,7 @@
           <w:color w:val="000000"/>
           <w:sz w:val="20"/>
         </w:rPr>
-        <w:t>. 2026. doi:10.1093/hmg/ddag016.</w:t>
+        <w:t>. 2026;35(5):ddag016. doi:10.1093/hmg/ddag016.</w:t>
       </w:r>
     </w:p>
     <w:p>
@@ -8387,7 +8622,7 @@
           <w:color w:val="000000"/>
           <w:sz w:val="20"/>
         </w:rPr>
-        <w:t xml:space="preserve">Gomez CM, et al. Spinocerebellar ataxia type 6: variable age of onset. </w:t>
+        <w:t xml:space="preserve">Gomez CM, Thompson RM, Gammack JT, Perlman SL, Dobyns WB, Truwit CL, et al. Spinocerebellar ataxia type 6: gaze-evoked and vertical nystagmus, Purkinje cell degeneration, and variable age of onset. </w:t>
       </w:r>
       <w:r>
         <w:rPr>
@@ -8406,7 +8641,7 @@
           <w:color w:val="000000"/>
           <w:sz w:val="20"/>
         </w:rPr>
-        <w:t>. 1997. doi:10.1002/ana.410420616.</w:t>
+        <w:t>. 1997;42(6):933–950. doi:10.1002/ana.410420616.</w:t>
       </w:r>
     </w:p>
     <w:p>
@@ -8429,7 +8664,7 @@
           <w:color w:val="000000"/>
           <w:sz w:val="20"/>
         </w:rPr>
-        <w:t xml:space="preserve">Anderson JH, et al. Spinocerebellar ataxia in monozygotic twins. </w:t>
+        <w:t xml:space="preserve">Anderson JH, Christova PS, Xie TD, Schott KS, Ward K, Gomez CM. Spinocerebellar ataxia in monozygotic twins. </w:t>
       </w:r>
       <w:r>
         <w:rPr>
@@ -8448,7 +8683,7 @@
           <w:color w:val="000000"/>
           <w:sz w:val="20"/>
         </w:rPr>
-        <w:t>. 2002. doi:10.1001/archneur.59.12.1945.</w:t>
+        <w:t>. 2002;59(12):1945–1951. doi:10.1001/archneur.59.12.1945.</w:t>
       </w:r>
     </w:p>
     <w:p>
@@ -8471,7 +8706,7 @@
           <w:color w:val="000000"/>
           <w:sz w:val="20"/>
         </w:rPr>
-        <w:t xml:space="preserve">Mitoma H, et al. Consensus paper: cerebellar reserve from cerebellar physiology to cerebellar disorders. </w:t>
+        <w:t xml:space="preserve">Mitoma H, Buffo A, Gelfo F, Guell X, Fucà E, Kakei S, et al. Consensus Paper. Cerebellar Reserve: From Cerebellar Physiology to Cerebellar Disorders. </w:t>
       </w:r>
       <w:r>
         <w:rPr>
@@ -8490,7 +8725,7 @@
           <w:color w:val="000000"/>
           <w:sz w:val="20"/>
         </w:rPr>
-        <w:t>. 2020. doi:10.1007/s12311-019-01091-9.</w:t>
+        <w:t>. 2020;19(1):131–153. doi:10.1007/s12311-019-01091-9.</w:t>
       </w:r>
     </w:p>
     <w:p>
@@ -8513,7 +8748,7 @@
           <w:color w:val="000000"/>
           <w:sz w:val="20"/>
         </w:rPr>
-        <w:t xml:space="preserve">Mitoma H, Manto M, Hampe CS. Time is cerebellum. </w:t>
+        <w:t xml:space="preserve">Mitoma H, Manto M, Hampe CS. Time Is Cerebellum. </w:t>
       </w:r>
       <w:r>
         <w:rPr>
@@ -8532,7 +8767,7 @@
           <w:color w:val="000000"/>
           <w:sz w:val="20"/>
         </w:rPr>
-        <w:t>. 2018. doi:10.1007/s12311-018-0925-6.</w:t>
+        <w:t>. 2018;17(4):387–391. doi:10.1007/s12311-018-0925-6.</w:t>
       </w:r>
     </w:p>
     <w:p>
@@ -8555,7 +8790,7 @@
           <w:color w:val="000000"/>
           <w:sz w:val="20"/>
         </w:rPr>
-        <w:t xml:space="preserve">Huang H, et al. Resilience to ER stress mitigates late membrane hyperexcitability in a murine SCA6 model. </w:t>
+        <w:t xml:space="preserve">Huang H, Charron TL, Fu M, Dunn M, Jones DM, Kumar P, et al. Resilience to Endoplasmic Reticulum Stress Mitigates Membrane Hyperexcitability Underlying Late Disease Onset in a Murine Model of SCA6. </w:t>
       </w:r>
       <w:r>
         <w:rPr>
@@ -8574,7 +8809,7 @@
           <w:color w:val="000000"/>
           <w:sz w:val="20"/>
         </w:rPr>
-        <w:t>. 2026. doi:10.1002/ana.78042.</w:t>
+        <w:t>. 2026;99(2):502–522. doi:10.1002/ana.78042.</w:t>
       </w:r>
     </w:p>
     <w:p>
@@ -8597,7 +8832,7 @@
           <w:color w:val="000000"/>
           <w:sz w:val="20"/>
         </w:rPr>
-        <w:t xml:space="preserve">Zu T, et al. Recovery from polyglutamine-induced neurodegeneration in conditional SCA1 transgenic mice. </w:t>
+        <w:t xml:space="preserve">Zu T, Duvick LA, Kaytor MD, Berlinger MS, Zoghbi HY, Clark HB, et al. Recovery from Polyglutamine-Induced Neurodegeneration in Conditional SCA1 Transgenic Mice. </w:t>
       </w:r>
       <w:r>
         <w:rPr>
@@ -8616,7 +8851,7 @@
           <w:color w:val="000000"/>
           <w:sz w:val="20"/>
         </w:rPr>
-        <w:t>. 2004. doi:10.1523/JNEUROSCI.2978-04.2004.</w:t>
+        <w:t>. 2004;24(40):8853–8861. doi:10.1523/JNEUROSCI.2978-04.2004.</w:t>
       </w:r>
     </w:p>
     <w:p>
@@ -8639,7 +8874,7 @@
           <w:color w:val="000000"/>
           <w:sz w:val="20"/>
         </w:rPr>
-        <w:t xml:space="preserve">Pilotto F, et al. Early molecular layer interneuron hyperactivity triggers Purkinje neuron degeneration in SCA1. </w:t>
+        <w:t xml:space="preserve">Pilotto F, Douthwaite C, Diab R, Ye X, Al Qassab Z, Tietje C, et al. Early molecular layer interneuron hyperactivity triggers Purkinje neuron degeneration in SCA1. </w:t>
       </w:r>
       <w:r>
         <w:rPr>
@@ -8658,7 +8893,7 @@
           <w:color w:val="000000"/>
           <w:sz w:val="20"/>
         </w:rPr>
-        <w:t>. 2023. doi:10.1016/j.neuron.2023.05.016.</w:t>
+        <w:t>. 2023;111(16):2523–2543.e10. doi:10.1016/j.neuron.2023.05.016.</w:t>
       </w:r>
     </w:p>
     <w:p>
@@ -8681,7 +8916,7 @@
           <w:color w:val="000000"/>
           <w:sz w:val="20"/>
         </w:rPr>
-        <w:t xml:space="preserve">Wang X, et al. Bergmann glia-specific loss of APC and non-cell-autonomous Purkinje-cell degeneration. </w:t>
+        <w:t xml:space="preserve">Wang X, Imura T, Sofroniew MV, Fushiki S. Loss of adenomatous polyposis coli in Bergmann glia disrupts their unique architecture and leads to cell nonautonomous neurodegeneration of cerebellar Purkinje neurons. </w:t>
       </w:r>
       <w:r>
         <w:rPr>
@@ -8700,7 +8935,7 @@
           <w:color w:val="000000"/>
           <w:sz w:val="20"/>
         </w:rPr>
-        <w:t>. 2011. doi:10.1002/glia.21154.</w:t>
+        <w:t>. 2011;59(6):857–868. doi:10.1002/glia.21154.</w:t>
       </w:r>
     </w:p>
     <w:p>
@@ -8723,7 +8958,7 @@
           <w:color w:val="000000"/>
           <w:sz w:val="20"/>
         </w:rPr>
-        <w:t xml:space="preserve">Lee C, et al. Oligodendrocyte dysfunction contributes to motor deficits and Purkinje cell axonopathy in SCA1. </w:t>
+        <w:t xml:space="preserve">Lee C, Grijalva RM, Tejwani L, Bae E, Chase A, Ro H, et al. Oligodendrocyte dysfunction contributes to motor deficits and Purkinje cell axonopathy in spinocerebellar ataxia type 1. </w:t>
       </w:r>
       <w:r>
         <w:rPr>
@@ -8742,7 +8977,7 @@
           <w:color w:val="000000"/>
           <w:sz w:val="20"/>
         </w:rPr>
-        <w:t>. 2026. doi:10.1172/JCI195723.</w:t>
+        <w:t>. 2026;136(12):e195723. doi:10.1172/JCI195723.</w:t>
       </w:r>
     </w:p>
     <w:p>
@@ -8765,7 +9000,7 @@
           <w:color w:val="000000"/>
           <w:sz w:val="20"/>
         </w:rPr>
-        <w:t xml:space="preserve">Ibrahim MF, et al. Enhanced mGluR1 function causes motor deficits and region-specific Purkinje cell dysfunction. </w:t>
+        <w:t xml:space="preserve">Ibrahim MF, Boyanova S, Cheng YC, Ligneul C, Bains RS, Johnpulle TC, et al. Enhanced mGluR1 function causes motor deficits and region-specific Purkinje cell dysfunction. </w:t>
       </w:r>
       <w:r>
         <w:rPr>
@@ -8784,7 +9019,7 @@
           <w:color w:val="000000"/>
           <w:sz w:val="20"/>
         </w:rPr>
-        <w:t>. 2026. doi:10.1093/brain/awaf477.</w:t>
+        <w:t>. 2026;149(8):2774–2790. doi:10.1093/brain/awaf477.</w:t>
       </w:r>
     </w:p>
     <w:p>
@@ -8807,7 +9042,7 @@
           <w:color w:val="000000"/>
           <w:sz w:val="20"/>
         </w:rPr>
-        <w:t xml:space="preserve">Bell B, et al. Functional and structural basis of a hypermorphic TRPC3 variant. </w:t>
+        <w:t xml:space="preserve">Bell B, Jaramillo-Granada AM, Romero LO, Gutierrez IA, Mallampalli VKPS, Fan G, et al. Functional and structural basis of a hypermorphic TRPC3 variant. </w:t>
       </w:r>
       <w:r>
         <w:rPr>
@@ -8826,7 +9061,7 @@
           <w:color w:val="000000"/>
           <w:sz w:val="20"/>
         </w:rPr>
-        <w:t>. 2026. doi:10.1126/sciadv.aec9284.</w:t>
+        <w:t>. 2026;12(13):eaec9284. doi:10.1126/sciadv.aec9284.</w:t>
       </w:r>
     </w:p>
     <w:p>
@@ -8849,7 +9084,7 @@
           <w:color w:val="000000"/>
           <w:sz w:val="20"/>
         </w:rPr>
-        <w:t xml:space="preserve">Ito-Ishida A, et al. Cbln1 regulates rapid formation and maintenance of excitatory synapses. </w:t>
+        <w:t xml:space="preserve">Ito-Ishida A, Miura E, Emi K, Matsuda K, Iijima T, Kondo T, et al. Cbln1 Regulates Rapid Formation and Maintenance of Excitatory Synapses in Mature Cerebellar Purkinje Cells In Vitro and In Vivo. </w:t>
       </w:r>
       <w:r>
         <w:rPr>
@@ -8868,7 +9103,7 @@
           <w:color w:val="000000"/>
           <w:sz w:val="20"/>
         </w:rPr>
-        <w:t>. 2008. doi:10.1523/JNEUROSCI.1030-08.2008.</w:t>
+        <w:t>. 2008;28(23):5920–5930. doi:10.1523/JNEUROSCI.1030-08.2008.</w:t>
       </w:r>
     </w:p>
     <w:p>
@@ -8891,7 +9126,7 @@
           <w:color w:val="000000"/>
           <w:sz w:val="20"/>
         </w:rPr>
-        <w:t xml:space="preserve">Takeuchi E, et al. Improvement of cerebellar ataxic gait by injecting Cbln1 into cbln1-null mice. </w:t>
+        <w:t xml:space="preserve">Takeuchi E, Ito-Ishida A, Yuzaki M, Yanagihara D. Improvement of cerebellar ataxic gait by injecting Cbln1 into the cerebellum of cbln1-null mice. </w:t>
       </w:r>
       <w:r>
         <w:rPr>
@@ -8910,7 +9145,7 @@
           <w:color w:val="000000"/>
           <w:sz w:val="20"/>
         </w:rPr>
-        <w:t>. 2018. doi:10.1038/s41598-018-24490-0.</w:t>
+        <w:t>. 2018;8(1):6184. doi:10.1038/s41598-018-24490-0.</w:t>
       </w:r>
     </w:p>
     <w:p>
@@ -8933,7 +9168,7 @@
           <w:color w:val="000000"/>
           <w:sz w:val="20"/>
         </w:rPr>
-        <w:t xml:space="preserve">Wang H, et al. Delta-type glutamate receptors are ligand-gated ion channels. </w:t>
+        <w:t xml:space="preserve">Wang H, Ahmed F, Khau J, Mondal AK, Twomey EC. Delta-type glutamate receptors are ligand-gated ion channels. </w:t>
       </w:r>
       <w:r>
         <w:rPr>
@@ -8952,7 +9187,7 @@
           <w:color w:val="000000"/>
           <w:sz w:val="20"/>
         </w:rPr>
-        <w:t>. 2025. doi:10.1038/s41586-025-09610-x.</w:t>
+        <w:t>. 2025;647(8091):1063–1071. doi:10.1038/s41586-025-09610-x.</w:t>
       </w:r>
     </w:p>
     <w:p>
@@ -8975,7 +9210,7 @@
           <w:color w:val="000000"/>
           <w:sz w:val="20"/>
         </w:rPr>
-        <w:t xml:space="preserve">Wilke C, et al. Neurofilaments in SCA3 at preataxic and ataxic stages. </w:t>
+        <w:t xml:space="preserve">Wilke C, Haas E, Reetz K, Faber J, Garcia-Moreno H, Santana MM, et al. Neurofilaments in spinocerebellar ataxia type 3: blood biomarkers at the preataxic and ataxic stage in humans and mice. </w:t>
       </w:r>
       <w:r>
         <w:rPr>
@@ -8994,7 +9229,7 @@
           <w:color w:val="000000"/>
           <w:sz w:val="20"/>
         </w:rPr>
-        <w:t>. 2020. doi:10.15252/emmm.201911803.</w:t>
+        <w:t>. 2020;12(7):e11803. doi:10.15252/emmm.201911803.</w:t>
       </w:r>
     </w:p>
     <w:p>
@@ -9017,7 +9252,7 @@
           <w:color w:val="000000"/>
           <w:sz w:val="20"/>
         </w:rPr>
-        <w:t xml:space="preserve">Berger M, et al. Progression of biological markers in SCA3: longitudinal ESMI data. </w:t>
+        <w:t xml:space="preserve">Berger M, Garcia-Moreno H, Ferreira M, Hübener-Schmid J, Schaprian T, Wegner P, et al. Progression of biological markers in spinocerebellar ataxia type 3: longitudinal analysis of prospective data from the ESMI cohort. </w:t>
       </w:r>
       <w:r>
         <w:rPr>
@@ -9036,7 +9271,7 @@
           <w:color w:val="000000"/>
           <w:sz w:val="20"/>
         </w:rPr>
-        <w:t>. 2025. doi:10.1016/j.lanepe.2025.101339.</w:t>
+        <w:t>. 2025;55:101339. doi:10.1016/j.lanepe.2025.101339.</w:t>
       </w:r>
     </w:p>
     <w:p>
@@ -9059,7 +9294,7 @@
           <w:color w:val="000000"/>
           <w:sz w:val="20"/>
         </w:rPr>
-        <w:t xml:space="preserve">Joers JM, et al. Neurochemical endpoints for early-stage SCA2/SCA3 trials in a multisite setting. </w:t>
+        <w:t xml:space="preserve">Joers JM, Wei Y, Deelchand DK, Berrington A, Park YW, Banan G, et al. Neurochemical Endpoints to Inform Early-Stage Trials of Spinocerebellar Ataxia 2 and 3 in a Multisite Setting. </w:t>
       </w:r>
       <w:r>
         <w:rPr>
@@ -9101,7 +9336,7 @@
           <w:color w:val="000000"/>
           <w:sz w:val="20"/>
         </w:rPr>
-        <w:t xml:space="preserve">Martins AC, et al. Rural environment as a risk factor for age at onset of Machado-Joseph disease. </w:t>
+        <w:t xml:space="preserve">Martins AC, Furtado GV, Pinheiro JDS, Saraiva-Pereira ML, Jardim LB. Rural Environment as a Risk Factor for the Age at Onset of Machado-Joseph Disease. </w:t>
       </w:r>
       <w:r>
         <w:rPr>
@@ -9120,7 +9355,7 @@
           <w:color w:val="000000"/>
           <w:sz w:val="20"/>
         </w:rPr>
-        <w:t>. 2025. doi:10.1002/mdc3.14338.</w:t>
+        <w:t>. 2025;12(4):520–526. doi:10.1002/mdc3.14338.</w:t>
       </w:r>
     </w:p>
     <w:p>
@@ -9143,7 +9378,7 @@
           <w:color w:val="000000"/>
           <w:sz w:val="20"/>
         </w:rPr>
-        <w:t xml:space="preserve">Benussi A, et al. Cerebello-spinal tDCS in ataxia. </w:t>
+        <w:t xml:space="preserve">Benussi A, Dell'Era V, Cantoni V, Bonetta E, Grasso R, Manenti R, et al. Cerebello-spinal tDCS in ataxia: A randomized, double-blind, sham-controlled, crossover trial. </w:t>
       </w:r>
       <w:r>
         <w:rPr>
@@ -9162,7 +9397,7 @@
           <w:color w:val="000000"/>
           <w:sz w:val="20"/>
         </w:rPr>
-        <w:t>. 2018. doi:10.1212/WNL.0000000000006210.</w:t>
+        <w:t>. 2018;91(12):e1090–e1101. doi:10.1212/WNL.0000000000006210.</w:t>
       </w:r>
     </w:p>
     <w:p>
@@ -9185,7 +9420,7 @@
           <w:color w:val="000000"/>
           <w:sz w:val="20"/>
         </w:rPr>
-        <w:t xml:space="preserve">Maas RPPWM, et al. Cerebellar tDCS in SCA3: randomized sham-controlled trial. </w:t>
+        <w:t xml:space="preserve">Maas RPPWM, Teerenstra S, Toni I, Klockgether T, Schutter DJLG, van de Warrenburg BPC. Cerebellar Transcranial Direct Current Stimulation in Spinocerebellar Ataxia Type 3: a Randomized, Double-Blind, Sham-Controlled Trial. </w:t>
       </w:r>
       <w:r>
         <w:rPr>
@@ -9204,7 +9439,7 @@
           <w:color w:val="000000"/>
           <w:sz w:val="20"/>
         </w:rPr>
-        <w:t>. 2022. doi:10.1007/s13311-022-01231-w.</w:t>
+        <w:t>. 2022;19(4):1259–1272. doi:10.1007/s13311-022-01231-w.</w:t>
       </w:r>
     </w:p>
     <w:p>
@@ -9227,7 +9462,7 @@
           <w:color w:val="000000"/>
           <w:sz w:val="20"/>
         </w:rPr>
-        <w:t xml:space="preserve">Hauser S, et al. Allele-specific targeting of mutant ataxin-3 in SCA3 iPSC-derived neurons. </w:t>
+        <w:t xml:space="preserve">Hauser S, Helm J, Kraft M, Korneck M, Hübener-Schmid J, Schöls L. Allele-specific targeting of mutant ataxin-3 by antisense oligonucleotides in SCA3-iPSC-derived neurons. </w:t>
       </w:r>
       <w:r>
         <w:rPr>
@@ -9246,7 +9481,7 @@
           <w:color w:val="000000"/>
           <w:sz w:val="20"/>
         </w:rPr>
-        <w:t>. 2022. doi:10.1016/j.omtn.2021.11.015.</w:t>
+        <w:t>. 2022;27:99–108. doi:10.1016/j.omtn.2021.11.015.</w:t>
       </w:r>
     </w:p>
     <w:p>
@@ -9269,7 +9504,7 @@
           <w:color w:val="000000"/>
           <w:sz w:val="20"/>
         </w:rPr>
-        <w:t>ClinicalTrials.gov. NCT05822908: VO659 in SCA1, SCA3 and Huntington disease. Status checked 19 August 2026.</w:t>
+        <w:t>ClinicalTrials.gov. A Phase 1/2a, Open-label Trial to Investigate the Safety, Tolerability, Pharmacokinetics and Pharmacodynamics of Multiple Ascending Doses of Intrathecally Administered VO659 in Participants With Spinocerebellar Ataxia Types 1, 3 and Huntington's Disease. ClinicalTrials.gov identifier: NCT05822908. Updated 19 August 2026; accessed 21 August 2026.</w:t>
       </w:r>
     </w:p>
     <w:p>
@@ -9292,7 +9527,7 @@
           <w:color w:val="000000"/>
           <w:sz w:val="20"/>
         </w:rPr>
-        <w:t xml:space="preserve">Ishihara T, et al. L-arginine in SCA6: multicentre randomized phase 2 trial. </w:t>
+        <w:t xml:space="preserve">Ishihara T, Tada M, Kanemitsu Y, Takahashi Y, Ishikawa K, Ikenaka K, et al. L-arginine in patients with spinocerebellar ataxia type 6: a multicentre, randomised, double-blind, placebo-controlled, phase 2 trial. </w:t>
       </w:r>
       <w:r>
         <w:rPr>
@@ -9311,7 +9546,7 @@
           <w:color w:val="000000"/>
           <w:sz w:val="20"/>
         </w:rPr>
-        <w:t>. 2024. doi:10.1016/j.eclinm.2024.102952.</w:t>
+        <w:t>. 2024;78:102952. doi:10.1016/j.eclinm.2024.102952.</w:t>
       </w:r>
     </w:p>
     <w:p>
@@ -9334,7 +9569,7 @@
           <w:color w:val="000000"/>
           <w:sz w:val="20"/>
         </w:rPr>
-        <w:t xml:space="preserve">Öz G, et al.; Ataxia Global Initiative Working Group on MRI Biomarkers. MRI end-points for clinical trials in ataxias: recommendations from the Ataxia Global Initiative MRI Biomarkers Working Group. </w:t>
+        <w:t xml:space="preserve">Öz G, Cocozza S, Rezende TJR, Henry PG, Faber J, Harding IH, et al. MRI end-points for clinical trials in ataxias: recommendations from the Ataxia Global Initiative MRI Biomarkers Working Group. </w:t>
       </w:r>
       <w:r>
         <w:rPr>
@@ -9353,22 +9588,7 @@
           <w:color w:val="000000"/>
           <w:sz w:val="20"/>
         </w:rPr>
-        <w:t>. 2026;22:439–456. doi:10.1038/s41582-026-01218-7.</w:t>
-      </w:r>
-    </w:p>
-    <w:p>
-      <w:pPr>
-        <w:keepLines w:val="0"/>
-        <w:jc w:val="both"/>
-      </w:pPr>
-      <w:r>
-        <w:rPr>
-          <w:rFonts w:ascii="Times New Roman" w:hAnsi="Times New Roman" w:eastAsia="Times New Roman"/>
-          <w:b w:val="0"/>
-          <w:color w:val="000000"/>
-          <w:sz w:val="20"/>
-        </w:rPr>
-        <w:t>The complete machine-readable bibliography is in references.bib.</w:t>
+        <w:t>. 2026;22(7):439–456. doi:10.1038/s41582-026-01218-7.</w:t>
       </w:r>
     </w:p>
     <w:sectPr>

</xml_diff>

<commit_message>
docs: archive figure-citation technical correction
</commit_message>
<xml_diff>
--- a/submission/the-cerebellum/package/01_Main_Manuscript.docx
+++ b/submission/the-cerebellum/package/01_Main_Manuscript.docx
@@ -616,7 +616,7 @@
           <w:color w:val="000000"/>
           <w:sz w:val="20"/>
         </w:rPr>
-        <w:t>The complete claim-by-claim audit is available in the evidence appendix and machine-readable matrix.</w:t>
+        <w:t>The complete claim-by-claim audit is available in the evidence appendix and machine-readable matrix. The nested architecture and evidentiary boundary are summarized in Fig. 1.</w:t>
       </w:r>
     </w:p>
     <w:p>
@@ -7057,7 +7057,7 @@
           <w:color w:val="000000"/>
           <w:sz w:val="20"/>
         </w:rPr>
-        <w:t>, or the proposed reserve fluxes. There is no biologically defensible common drug intervention and no pooled primary efficacy test.</w:t>
+        <w:t>, or the proposed reserve fluxes. There is no biologically defensible common drug intervention and no pooled primary efficacy test. The prospective validation and gated early-intervention programme is summarized in Fig. 3.</w:t>
       </w:r>
     </w:p>
     <w:p>

</xml_diff>